<commit_message>
Deploying to gh-pages from @ volodya-lombrozo/newsman@8c8f1031ae7a73c803c344dfbe3e74f3d86de20f 🚀
</commit_message>
<xml_diff>
--- a/2026/08/24/24.08.2026.volodya-lombrozo.gpt-5-6.docx
+++ b/2026/08/24/24.08.2026.volodya-lombrozo.gpt-5-6.docx
@@ -34,9 +34,6 @@
       </w:r>
     </w:p>
     <w:p>
-      <w:pPr>
-        <w:pStyle w:val="Heading3"/>
-      </w:pPr>
       <w:r>
         <w:rPr>
           <w:rFonts w:ascii="Times New Roman" w:hAnsi="Times New Roman" w:cs="Times New Roman"/>
@@ -47,9 +44,6 @@
       </w:r>
     </w:p>
     <w:p>
-      <w:pPr>
-        <w:pStyle w:val="Heading3"/>
-      </w:pPr>
       <w:r>
         <w:rPr>
           <w:rFonts w:ascii="Times New Roman" w:hAnsi="Times New Roman" w:cs="Times New Roman"/>
@@ -60,26 +54,24 @@
       </w:r>
     </w:p>
     <w:p>
-      <w:pPr>
-        <w:pStyle w:val="Heading3"/>
-      </w:pPr>
-      <w:r>
-        <w:rPr>
-          <w:rFonts w:ascii="Times New Roman" w:hAnsi="Times New Roman" w:cs="Times New Roman"/>
-          <w:sz w:val="24"/>
-          <w:szCs w:val="24"/>
-        </w:rPr>
-        <w:t xml:space="preserve">Risks:</w:t>
-      </w:r>
-    </w:p>
-    <w:p>
-      <w:r>
-        <w:rPr>
-          <w:rFonts w:ascii="Times New Roman" w:hAnsi="Times New Roman" w:cs="Times New Roman"/>
-          <w:sz w:val="24"/>
-          <w:szCs w:val="24"/>
-        </w:rPr>
-        <w:t xml:space="preserve">No risks identified</w:t>
+      <w:r>
+        <w:rPr>
+          <w:rFonts w:ascii="Times New Roman" w:hAnsi="Times New Roman" w:cs="Times New Roman"/>
+          <w:sz w:val="24"/>
+          <w:szCs w:val="24"/>
+        </w:rPr>
+        <w:t xml:space="preserve">Risks:  </w:t>
+      </w:r>
+      <w:r>
+        <w:br/>
+      </w:r>
+      <w:r>
+        <w:rPr>
+          <w:rFonts w:ascii="Times New Roman" w:hAnsi="Times New Roman" w:cs="Times New Roman"/>
+          <w:sz w:val="24"/>
+          <w:szCs w:val="24"/>
+        </w:rPr>
+        <w:t xml:space="preserve">No risks identified.</w:t>
       </w:r>
     </w:p>
     <w:p>
@@ -123,6 +115,59 @@
           <w:szCs w:val="24"/>
         </w:rPr>
         <w:t xml:space="preserve">2026-08-24</w:t>
+      </w:r>
+      <w:r>
+        <w:br/>
+      </w:r>
+      <w:r>
+        <w:rPr>
+          <w:rFonts w:ascii="Times New Roman" w:hAnsi="Times New Roman" w:cs="Times New Roman"/>
+          <w:sz w:val="24"/>
+          <w:szCs w:val="24"/>
+        </w:rPr>
+        <w:t xml:space="preserve">------</w:t>
+      </w:r>
+      <w:r>
+        <w:br/>
+      </w:r>
+      <w:r>
+        <w:rPr>
+          <w:rFonts w:ascii="Times New Roman" w:hAnsi="Times New Roman" w:cs="Times New Roman"/>
+          <w:sz w:val="24"/>
+          <w:szCs w:val="24"/>
+        </w:rPr>
+        <w:t xml:space="preserve">Closed Pull Requests:</w:t>
+      </w:r>
+    </w:p>
+    <w:p>
+      <w:r>
+        <w:rPr>
+          <w:rFonts w:ascii="Times New Roman" w:hAnsi="Times New Roman" w:cs="Times New Roman"/>
+          <w:sz w:val="24"/>
+          <w:szCs w:val="24"/>
+        </w:rPr>
+        <w:t xml:space="preserve">Open Issues:</w:t>
+      </w:r>
+    </w:p>
+    <w:p>
+      <w:r>
+        <w:rPr>
+          <w:rFonts w:ascii="Times New Roman" w:hAnsi="Times New Roman" w:cs="Times New Roman"/>
+          <w:sz w:val="24"/>
+          <w:szCs w:val="24"/>
+        </w:rPr>
+        <w:t xml:space="preserve">Issues reviewed: 14 (labeled/assigned), 6 closed</w:t>
+      </w:r>
+      <w:r>
+        <w:br/>
+      </w:r>
+      <w:r>
+        <w:rPr>
+          <w:rFonts w:ascii="Times New Roman" w:hAnsi="Times New Roman" w:cs="Times New Roman"/>
+          <w:sz w:val="24"/>
+          <w:szCs w:val="24"/>
+        </w:rPr>
+        <w:t xml:space="preserve">PRs reviewed: 9</w:t>
       </w:r>
     </w:p>
     <w:sectPr/>

</xml_diff>